<commit_message>
Refresh final GitHub evidence screenshot
</commit_message>
<xml_diff>
--- a/REVIEW2_SUBMISSION.docx
+++ b/REVIEW2_SUBMISSION.docx
@@ -2911,7 +2911,7 @@
         <w:rPr/>
         <w:drawing>
           <wp:inline distT="0" distB="0" distL="0" distR="0">
-            <wp:extent cx="6477000" cy="5791200"/>
+            <wp:extent cx="6477000" cy="13877925"/>
             <wp:effectExtent l="0" t="0" r="0" b="0"/>
             <wp:docPr id="2" name="Image2" title="Public GitHub repository"/>
             <wp:cNvGraphicFramePr>
@@ -2935,7 +2935,7 @@
                   <pic:spPr bwMode="auto">
                     <a:xfrm>
                       <a:off x="0" y="0"/>
-                      <a:ext cx="6477000" cy="5791200"/>
+                      <a:ext cx="6477000" cy="13877925"/>
                     </a:xfrm>
                     <a:prstGeom prst="rect">
                       <a:avLst/>

</xml_diff>